<commit_message>
Estrutura for e operadores bitwise em Python
</commit_message>
<xml_diff>
--- a/Anotações/Outubro de 2024/Dia 23 - Estrutura for em Python.docx
+++ b/Anotações/Outubro de 2024/Dia 23 - Estrutura for em Python.docx
@@ -43,8 +43,8 @@
         </w:rPr>
       </w:pPr>
       <w:r>
-        <w:object w:dxaOrig="4529" w:dyaOrig="2009">
-          <v:rect xmlns:o="urn:schemas-microsoft-com:office:office" xmlns:v="urn:schemas-microsoft-com:vml" id="rectole0000000000" style="width:226.450000pt;height:100.450000pt" o:preferrelative="t" o:ole="">
+        <w:object w:dxaOrig="4575" w:dyaOrig="2024">
+          <v:rect xmlns:o="urn:schemas-microsoft-com:office:office" xmlns:v="urn:schemas-microsoft-com:vml" id="rectole0000000000" style="width:228.750000pt;height:101.200000pt" o:preferrelative="t" o:ole="">
             <o:lock v:ext="edit"/>
             <v:imagedata xmlns:r="http://schemas.openxmlformats.org/officeDocument/2006/relationships" r:id="docRId1" o:title=""/>
           </v:rect>
@@ -405,6 +405,448 @@
           <w:shd w:fill="auto" w:val="clear"/>
         </w:rPr>
         <w:t xml:space="preserve">O primeiro número a ser mostrado no console é 2, e se não tivessemos o terceiro argumento ele contaria até 7 de 1 em 1, porém, por conta do terceiro argumento ser um 3 ele vai contar do 2 para o 5 e o próximo seria um 8, porém como continuaria contando até 7, só que de 3 em 3 o 8 não é contado.</w:t>
+      </w:r>
+    </w:p>
+    <w:p>
+      <w:pPr>
+        <w:spacing w:before="0" w:after="200" w:line="276"/>
+        <w:ind w:right="0" w:left="0" w:firstLine="0"/>
+        <w:jc w:val="left"/>
+        <w:rPr>
+          <w:rFonts w:ascii="Calibri" w:hAnsi="Calibri" w:cs="Calibri" w:eastAsia="Calibri"/>
+          <w:color w:val="auto"/>
+          <w:spacing w:val="0"/>
+          <w:position w:val="0"/>
+          <w:sz w:val="22"/>
+          <w:shd w:fill="auto" w:val="clear"/>
+        </w:rPr>
+      </w:pPr>
+      <w:r>
+        <w:rPr>
+          <w:rFonts w:ascii="Calibri" w:hAnsi="Calibri" w:cs="Calibri" w:eastAsia="Calibri"/>
+          <w:color w:val="auto"/>
+          <w:spacing w:val="0"/>
+          <w:position w:val="0"/>
+          <w:sz w:val="22"/>
+          <w:shd w:fill="auto" w:val="clear"/>
+        </w:rPr>
+        <w:t xml:space="preserve">As funções break e continue funcionam exatamente como em Java.</w:t>
+      </w:r>
+    </w:p>
+    <w:p>
+      <w:pPr>
+        <w:spacing w:before="0" w:after="200" w:line="276"/>
+        <w:ind w:right="0" w:left="0" w:firstLine="0"/>
+        <w:jc w:val="left"/>
+        <w:rPr>
+          <w:rFonts w:ascii="Calibri" w:hAnsi="Calibri" w:cs="Calibri" w:eastAsia="Calibri"/>
+          <w:color w:val="auto"/>
+          <w:spacing w:val="0"/>
+          <w:position w:val="0"/>
+          <w:sz w:val="22"/>
+          <w:shd w:fill="auto" w:val="clear"/>
+        </w:rPr>
+      </w:pPr>
+      <w:r>
+        <w:rPr>
+          <w:rFonts w:ascii="Calibri" w:hAnsi="Calibri" w:cs="Calibri" w:eastAsia="Calibri"/>
+          <w:color w:val="auto"/>
+          <w:spacing w:val="0"/>
+          <w:position w:val="0"/>
+          <w:sz w:val="22"/>
+          <w:shd w:fill="auto" w:val="clear"/>
+        </w:rPr>
+        <w:t xml:space="preserve">Nós podemos usar também else nas estruturas while e nas estruturas for.</w:t>
+      </w:r>
+    </w:p>
+    <w:p>
+      <w:pPr>
+        <w:spacing w:before="0" w:after="200" w:line="276"/>
+        <w:ind w:right="0" w:left="0" w:firstLine="0"/>
+        <w:jc w:val="left"/>
+        <w:rPr>
+          <w:rFonts w:ascii="Calibri" w:hAnsi="Calibri" w:cs="Calibri" w:eastAsia="Calibri"/>
+          <w:color w:val="auto"/>
+          <w:spacing w:val="0"/>
+          <w:position w:val="0"/>
+          <w:sz w:val="22"/>
+          <w:shd w:fill="auto" w:val="clear"/>
+        </w:rPr>
+      </w:pPr>
+      <w:r>
+        <w:rPr>
+          <w:rFonts w:ascii="Calibri" w:hAnsi="Calibri" w:cs="Calibri" w:eastAsia="Calibri"/>
+          <w:color w:val="auto"/>
+          <w:spacing w:val="0"/>
+          <w:position w:val="0"/>
+          <w:sz w:val="22"/>
+          <w:shd w:fill="auto" w:val="clear"/>
+        </w:rPr>
+        <w:t xml:space="preserve">Nas estruturas for o valor armazenado é o último a ter sido contado. Por exemplo:</w:t>
+      </w:r>
+    </w:p>
+    <w:p>
+      <w:pPr>
+        <w:spacing w:before="0" w:after="200" w:line="276"/>
+        <w:ind w:right="0" w:left="0" w:firstLine="0"/>
+        <w:jc w:val="left"/>
+        <w:rPr>
+          <w:rFonts w:ascii="Calibri" w:hAnsi="Calibri" w:cs="Calibri" w:eastAsia="Calibri"/>
+          <w:color w:val="auto"/>
+          <w:spacing w:val="0"/>
+          <w:position w:val="0"/>
+          <w:sz w:val="22"/>
+          <w:shd w:fill="auto" w:val="clear"/>
+        </w:rPr>
+      </w:pPr>
+      <w:r>
+        <w:rPr>
+          <w:rFonts w:ascii="Calibri" w:hAnsi="Calibri" w:cs="Calibri" w:eastAsia="Calibri"/>
+          <w:color w:val="auto"/>
+          <w:spacing w:val="0"/>
+          <w:position w:val="0"/>
+          <w:sz w:val="22"/>
+          <w:shd w:fill="auto" w:val="clear"/>
+        </w:rPr>
+        <w:t xml:space="preserve">i = 12</w:t>
+      </w:r>
+    </w:p>
+    <w:p>
+      <w:pPr>
+        <w:spacing w:before="0" w:after="200" w:line="276"/>
+        <w:ind w:right="0" w:left="0" w:firstLine="0"/>
+        <w:jc w:val="left"/>
+        <w:rPr>
+          <w:rFonts w:ascii="Calibri" w:hAnsi="Calibri" w:cs="Calibri" w:eastAsia="Calibri"/>
+          <w:color w:val="auto"/>
+          <w:spacing w:val="0"/>
+          <w:position w:val="0"/>
+          <w:sz w:val="22"/>
+          <w:shd w:fill="auto" w:val="clear"/>
+        </w:rPr>
+      </w:pPr>
+      <w:r>
+        <w:rPr>
+          <w:rFonts w:ascii="Calibri" w:hAnsi="Calibri" w:cs="Calibri" w:eastAsia="Calibri"/>
+          <w:color w:val="auto"/>
+          <w:spacing w:val="0"/>
+          <w:position w:val="0"/>
+          <w:sz w:val="22"/>
+          <w:shd w:fill="auto" w:val="clear"/>
+        </w:rPr>
+        <w:t xml:space="preserve">for i in range(2, 21, 3):</w:t>
+      </w:r>
+    </w:p>
+    <w:p>
+      <w:pPr>
+        <w:spacing w:before="0" w:after="200" w:line="276"/>
+        <w:ind w:right="0" w:left="0" w:firstLine="0"/>
+        <w:jc w:val="left"/>
+        <w:rPr>
+          <w:rFonts w:ascii="Calibri" w:hAnsi="Calibri" w:cs="Calibri" w:eastAsia="Calibri"/>
+          <w:color w:val="auto"/>
+          <w:spacing w:val="0"/>
+          <w:position w:val="0"/>
+          <w:sz w:val="22"/>
+          <w:shd w:fill="auto" w:val="clear"/>
+        </w:rPr>
+      </w:pPr>
+      <w:r>
+        <w:rPr>
+          <w:rFonts w:ascii="Calibri" w:hAnsi="Calibri" w:cs="Calibri" w:eastAsia="Calibri"/>
+          <w:color w:val="auto"/>
+          <w:spacing w:val="0"/>
+          <w:position w:val="0"/>
+          <w:sz w:val="22"/>
+          <w:shd w:fill="auto" w:val="clear"/>
+        </w:rPr>
+        <w:t xml:space="preserve">    print(i)</w:t>
+      </w:r>
+    </w:p>
+    <w:p>
+      <w:pPr>
+        <w:spacing w:before="0" w:after="200" w:line="276"/>
+        <w:ind w:right="0" w:left="0" w:firstLine="0"/>
+        <w:jc w:val="left"/>
+        <w:rPr>
+          <w:rFonts w:ascii="Calibri" w:hAnsi="Calibri" w:cs="Calibri" w:eastAsia="Calibri"/>
+          <w:color w:val="auto"/>
+          <w:spacing w:val="0"/>
+          <w:position w:val="0"/>
+          <w:sz w:val="22"/>
+          <w:shd w:fill="auto" w:val="clear"/>
+        </w:rPr>
+      </w:pPr>
+      <w:r>
+        <w:rPr>
+          <w:rFonts w:ascii="Calibri" w:hAnsi="Calibri" w:cs="Calibri" w:eastAsia="Calibri"/>
+          <w:color w:val="auto"/>
+          <w:spacing w:val="0"/>
+          <w:position w:val="0"/>
+          <w:sz w:val="22"/>
+          <w:shd w:fill="auto" w:val="clear"/>
+        </w:rPr>
+        <w:t xml:space="preserve">else:</w:t>
+      </w:r>
+    </w:p>
+    <w:p>
+      <w:pPr>
+        <w:spacing w:before="0" w:after="200" w:line="276"/>
+        <w:ind w:right="0" w:left="0" w:firstLine="0"/>
+        <w:jc w:val="left"/>
+        <w:rPr>
+          <w:rFonts w:ascii="Calibri" w:hAnsi="Calibri" w:cs="Calibri" w:eastAsia="Calibri"/>
+          <w:color w:val="auto"/>
+          <w:spacing w:val="0"/>
+          <w:position w:val="0"/>
+          <w:sz w:val="22"/>
+          <w:shd w:fill="auto" w:val="clear"/>
+        </w:rPr>
+      </w:pPr>
+      <w:r>
+        <w:rPr>
+          <w:rFonts w:ascii="Calibri" w:hAnsi="Calibri" w:cs="Calibri" w:eastAsia="Calibri"/>
+          <w:color w:val="auto"/>
+          <w:spacing w:val="0"/>
+          <w:position w:val="0"/>
+          <w:sz w:val="22"/>
+          <w:shd w:fill="auto" w:val="clear"/>
+        </w:rPr>
+        <w:t xml:space="preserve">    print("else:", i)</w:t>
+      </w:r>
+    </w:p>
+    <w:p>
+      <w:pPr>
+        <w:spacing w:before="0" w:after="200" w:line="276"/>
+        <w:ind w:right="0" w:left="0" w:firstLine="0"/>
+        <w:jc w:val="left"/>
+        <w:rPr>
+          <w:rFonts w:ascii="Calibri" w:hAnsi="Calibri" w:cs="Calibri" w:eastAsia="Calibri"/>
+          <w:color w:val="auto"/>
+          <w:spacing w:val="0"/>
+          <w:position w:val="0"/>
+          <w:sz w:val="22"/>
+          <w:shd w:fill="auto" w:val="clear"/>
+        </w:rPr>
+      </w:pPr>
+      <w:r>
+        <w:rPr>
+          <w:rFonts w:ascii="Calibri" w:hAnsi="Calibri" w:cs="Calibri" w:eastAsia="Calibri"/>
+          <w:color w:val="auto"/>
+          <w:spacing w:val="0"/>
+          <w:position w:val="0"/>
+          <w:sz w:val="22"/>
+          <w:shd w:fill="auto" w:val="clear"/>
+        </w:rPr>
+        <w:t xml:space="preserve">O último número a ser contado será 20, e portanto o else ira imprimir o número 20.</w:t>
+      </w:r>
+    </w:p>
+    <w:p>
+      <w:pPr>
+        <w:spacing w:before="0" w:after="200" w:line="276"/>
+        <w:ind w:right="0" w:left="0" w:firstLine="0"/>
+        <w:jc w:val="left"/>
+        <w:rPr>
+          <w:rFonts w:ascii="Calibri" w:hAnsi="Calibri" w:cs="Calibri" w:eastAsia="Calibri"/>
+          <w:color w:val="auto"/>
+          <w:spacing w:val="0"/>
+          <w:position w:val="0"/>
+          <w:sz w:val="22"/>
+          <w:shd w:fill="auto" w:val="clear"/>
+        </w:rPr>
+      </w:pPr>
+      <w:r>
+        <w:rPr>
+          <w:rFonts w:ascii="Calibri" w:hAnsi="Calibri" w:cs="Calibri" w:eastAsia="Calibri"/>
+          <w:color w:val="auto"/>
+          <w:spacing w:val="0"/>
+          <w:position w:val="0"/>
+          <w:sz w:val="22"/>
+          <w:shd w:fill="auto" w:val="clear"/>
+        </w:rPr>
+        <w:t xml:space="preserve">Um pouco diferente do while. Exemplo:</w:t>
+      </w:r>
+    </w:p>
+    <w:p>
+      <w:pPr>
+        <w:spacing w:before="0" w:after="200" w:line="276"/>
+        <w:ind w:right="0" w:left="0" w:firstLine="0"/>
+        <w:jc w:val="left"/>
+        <w:rPr>
+          <w:rFonts w:ascii="Calibri" w:hAnsi="Calibri" w:cs="Calibri" w:eastAsia="Calibri"/>
+          <w:color w:val="auto"/>
+          <w:spacing w:val="0"/>
+          <w:position w:val="0"/>
+          <w:sz w:val="22"/>
+          <w:shd w:fill="auto" w:val="clear"/>
+        </w:rPr>
+      </w:pPr>
+      <w:r>
+        <w:rPr>
+          <w:rFonts w:ascii="Calibri" w:hAnsi="Calibri" w:cs="Calibri" w:eastAsia="Calibri"/>
+          <w:color w:val="auto"/>
+          <w:spacing w:val="0"/>
+          <w:position w:val="0"/>
+          <w:sz w:val="22"/>
+          <w:shd w:fill="auto" w:val="clear"/>
+        </w:rPr>
+        <w:t xml:space="preserve">i = 1</w:t>
+      </w:r>
+    </w:p>
+    <w:p>
+      <w:pPr>
+        <w:spacing w:before="0" w:after="200" w:line="276"/>
+        <w:ind w:right="0" w:left="0" w:firstLine="0"/>
+        <w:jc w:val="left"/>
+        <w:rPr>
+          <w:rFonts w:ascii="Calibri" w:hAnsi="Calibri" w:cs="Calibri" w:eastAsia="Calibri"/>
+          <w:color w:val="auto"/>
+          <w:spacing w:val="0"/>
+          <w:position w:val="0"/>
+          <w:sz w:val="22"/>
+          <w:shd w:fill="auto" w:val="clear"/>
+        </w:rPr>
+      </w:pPr>
+      <w:r>
+        <w:rPr>
+          <w:rFonts w:ascii="Calibri" w:hAnsi="Calibri" w:cs="Calibri" w:eastAsia="Calibri"/>
+          <w:color w:val="auto"/>
+          <w:spacing w:val="0"/>
+          <w:position w:val="0"/>
+          <w:sz w:val="22"/>
+          <w:shd w:fill="auto" w:val="clear"/>
+        </w:rPr>
+        <w:t xml:space="preserve">while i &lt; 5:</w:t>
+      </w:r>
+    </w:p>
+    <w:p>
+      <w:pPr>
+        <w:spacing w:before="0" w:after="200" w:line="276"/>
+        <w:ind w:right="0" w:left="0" w:firstLine="0"/>
+        <w:jc w:val="left"/>
+        <w:rPr>
+          <w:rFonts w:ascii="Calibri" w:hAnsi="Calibri" w:cs="Calibri" w:eastAsia="Calibri"/>
+          <w:color w:val="auto"/>
+          <w:spacing w:val="0"/>
+          <w:position w:val="0"/>
+          <w:sz w:val="22"/>
+          <w:shd w:fill="auto" w:val="clear"/>
+        </w:rPr>
+      </w:pPr>
+      <w:r>
+        <w:rPr>
+          <w:rFonts w:ascii="Calibri" w:hAnsi="Calibri" w:cs="Calibri" w:eastAsia="Calibri"/>
+          <w:color w:val="auto"/>
+          <w:spacing w:val="0"/>
+          <w:position w:val="0"/>
+          <w:sz w:val="22"/>
+          <w:shd w:fill="auto" w:val="clear"/>
+        </w:rPr>
+        <w:t xml:space="preserve">    print(i)</w:t>
+      </w:r>
+    </w:p>
+    <w:p>
+      <w:pPr>
+        <w:spacing w:before="0" w:after="200" w:line="276"/>
+        <w:ind w:right="0" w:left="0" w:firstLine="0"/>
+        <w:jc w:val="left"/>
+        <w:rPr>
+          <w:rFonts w:ascii="Calibri" w:hAnsi="Calibri" w:cs="Calibri" w:eastAsia="Calibri"/>
+          <w:color w:val="auto"/>
+          <w:spacing w:val="0"/>
+          <w:position w:val="0"/>
+          <w:sz w:val="22"/>
+          <w:shd w:fill="auto" w:val="clear"/>
+        </w:rPr>
+      </w:pPr>
+      <w:r>
+        <w:rPr>
+          <w:rFonts w:ascii="Calibri" w:hAnsi="Calibri" w:cs="Calibri" w:eastAsia="Calibri"/>
+          <w:color w:val="auto"/>
+          <w:spacing w:val="0"/>
+          <w:position w:val="0"/>
+          <w:sz w:val="22"/>
+          <w:shd w:fill="auto" w:val="clear"/>
+        </w:rPr>
+        <w:t xml:space="preserve">    i += 2</w:t>
+      </w:r>
+    </w:p>
+    <w:p>
+      <w:pPr>
+        <w:spacing w:before="0" w:after="200" w:line="276"/>
+        <w:ind w:right="0" w:left="0" w:firstLine="0"/>
+        <w:jc w:val="left"/>
+        <w:rPr>
+          <w:rFonts w:ascii="Calibri" w:hAnsi="Calibri" w:cs="Calibri" w:eastAsia="Calibri"/>
+          <w:color w:val="auto"/>
+          <w:spacing w:val="0"/>
+          <w:position w:val="0"/>
+          <w:sz w:val="22"/>
+          <w:shd w:fill="auto" w:val="clear"/>
+        </w:rPr>
+      </w:pPr>
+      <w:r>
+        <w:rPr>
+          <w:rFonts w:ascii="Calibri" w:hAnsi="Calibri" w:cs="Calibri" w:eastAsia="Calibri"/>
+          <w:color w:val="auto"/>
+          <w:spacing w:val="0"/>
+          <w:position w:val="0"/>
+          <w:sz w:val="22"/>
+          <w:shd w:fill="auto" w:val="clear"/>
+        </w:rPr>
+        <w:t xml:space="preserve">else:</w:t>
+      </w:r>
+    </w:p>
+    <w:p>
+      <w:pPr>
+        <w:spacing w:before="0" w:after="200" w:line="276"/>
+        <w:ind w:right="0" w:left="0" w:firstLine="0"/>
+        <w:jc w:val="left"/>
+        <w:rPr>
+          <w:rFonts w:ascii="Calibri" w:hAnsi="Calibri" w:cs="Calibri" w:eastAsia="Calibri"/>
+          <w:color w:val="auto"/>
+          <w:spacing w:val="0"/>
+          <w:position w:val="0"/>
+          <w:sz w:val="22"/>
+          <w:shd w:fill="auto" w:val="clear"/>
+        </w:rPr>
+      </w:pPr>
+      <w:r>
+        <w:rPr>
+          <w:rFonts w:ascii="Calibri" w:hAnsi="Calibri" w:cs="Calibri" w:eastAsia="Calibri"/>
+          <w:color w:val="auto"/>
+          <w:spacing w:val="0"/>
+          <w:position w:val="0"/>
+          <w:sz w:val="22"/>
+          <w:shd w:fill="auto" w:val="clear"/>
+        </w:rPr>
+        <w:t xml:space="preserve">    print("else:", i)</w:t>
+      </w:r>
+    </w:p>
+    <w:p>
+      <w:pPr>
+        <w:spacing w:before="0" w:after="200" w:line="276"/>
+        <w:ind w:right="0" w:left="0" w:firstLine="0"/>
+        <w:jc w:val="left"/>
+        <w:rPr>
+          <w:rFonts w:ascii="Calibri" w:hAnsi="Calibri" w:cs="Calibri" w:eastAsia="Calibri"/>
+          <w:color w:val="auto"/>
+          <w:spacing w:val="0"/>
+          <w:position w:val="0"/>
+          <w:sz w:val="22"/>
+          <w:shd w:fill="auto" w:val="clear"/>
+        </w:rPr>
+      </w:pPr>
+      <w:r>
+        <w:rPr>
+          <w:rFonts w:ascii="Calibri" w:hAnsi="Calibri" w:cs="Calibri" w:eastAsia="Calibri"/>
+          <w:color w:val="auto"/>
+          <w:spacing w:val="0"/>
+          <w:position w:val="0"/>
+          <w:sz w:val="22"/>
+          <w:shd w:fill="auto" w:val="clear"/>
+        </w:rPr>
+        <w:t xml:space="preserve">Nessa estrutura o número a ser imprimido será 5, pois mesmo depois do print() acontecer dentro do while a variável de controle ainda recebe uma alteração.</w:t>
       </w:r>
     </w:p>
   </w:body>

</xml_diff>